<commit_message>
Update Data Sources Inventory with 2026-07-20 live figures
Kontur/WorldPop population feature counts were still showing the
pre-fix numbers (TR 457,761/MG 349,138/MY 158,154 Kontur; TR
138,932/MG 110,926 WorldPop) from before commit 87ec4bc coarsened
both to a smaller H3 resolution to stop the population layer from
hitting the DB statement timeout on toggle. Replaced with the current
live counts (verified against the exposure_datasets table today:
Kontur TR 20,411/MG 13,889/MY 8,832; WorldPop TR 19,930/MG 16,227) and
added a note explaining why the counts dropped (resolution change, not
data loss — total population sum is unchanged). Also noted the
graduated per-layer color coding added in the same commit, and bumped
the document date. Roads/rivers/basins/hazard-API sections were
re-verified against the live database and matched already, so left
unchanged.

Co-Authored-By: Claude Sonnet 5 <noreply@anthropic.com>
</commit_message>
<xml_diff>
--- a/docs/Data_Sources_Inventory_EN.docx
+++ b/docs/Data_Sources_Inventory_EN.docx
@@ -43,7 +43,7 @@
           <w:sz w:val="22"/>
           <w:szCs w:val="22"/>
         </w:rPr>
-        <w:t xml:space="preserve">Updated 2026-07-19. This document brings together, in a single list, every data source currently in actual use in the project, how each one is fetched or processed, and which category it falls into (live API, one-time aggregation, static file, configured-but-not-wired, or manual upload). It was compiled by scanning the Edge Functions under supabase/functions and the data_sources seed records under supabase/migrations, and reflects real, live-verified data — not just written code.</w:t>
+        <w:t xml:space="preserve">Updated 2026-07-20. This document brings together, in a single list, every data source currently in actual use in the project, how each one is fetched or processed, and which category it falls into (live API, one-time aggregation, static file, configured-but-not-wired, or manual upload). It was compiled by scanning the Edge Functions under supabase/functions and the data_sources seed records under supabase/migrations, and reflects real, live-verified data — not just written code.</w:t>
       </w:r>
     </w:p>
     <w:p>
@@ -1662,7 +1662,7 @@
           <w:sz w:val="22"/>
           <w:szCs w:val="22"/>
         </w:rPr>
-        <w:t xml:space="preserve">Kontur live and running for all three onboarded countries — real data as of 2026-07-19: Turkey 457,761 features, Madagascar 349,138 features, Malaysia 158,154 features. WorldPop live for Turkey and Madagascar: Turkey 138,932 hexagons, Madagascar 110,926 hexagons.</w:t>
+        <w:t xml:space="preserve">Kontur live and running for all three onboarded countries — real data as of 2026-07-20: Turkey 20,411 features, Madagascar 13,889 features, Malaysia 8,832 features. WorldPop live for Turkey and Madagascar: Turkey 19,930 hexagons, Madagascar 16,227 hexagons. Feature counts are lower than the previous update because a 2026-07-19 fix (commit 87ec4bc) re-aggregated both sources to a coarser H3 resolution — Kontur to resolution 6 (one level coarser than WorldPop's resolution 7) — after discovering the original per-country resolution produced too many hexagons for get_dataset_features_geojson to serialize before the database statement timeout, so the population layer was silently failing to render on toggle. Total summed population is unchanged; only the hexagon cell count is smaller.</w:t>
       </w:r>
     </w:p>
     <w:p>
@@ -1715,7 +1715,7 @@
           <w:sz w:val="22"/>
           <w:szCs w:val="22"/>
         </w:rPr>
-        <w:t xml:space="preserve">The Google Roads API is explicitly not used — it is a paid service (roughly $150+/month). OSM/Overpass, the free alternative, is now fully wired: a periodic import queries OpenStreetMap's road network per served country (motorway/trunk/primary classification) and writes it to exposure_datasets/exposure_features. Live data as of 2026-07-19: Turkey 65,010 features, Madagascar 2,192 features (Madagascar has no OSM ways tagged “motorway”, so its road network relies on the trunk/primary tiers).</w:t>
+        <w:t xml:space="preserve">The Google Roads API is explicitly not used — it is a paid service (roughly $150+/month). OSM/Overpass, the free alternative, is now fully wired: a periodic import queries OpenStreetMap's road network per served country (motorway/trunk/primary classification) and writes it to exposure_datasets/exposure_features. Live data as of 2026-07-20: Turkey 65,010 features, Madagascar 2,192 features (Madagascar has no OSM ways tagged “motorway”, so its road network relies on the trunk/primary tiers).</w:t>
       </w:r>
     </w:p>
     <w:p>
@@ -1864,7 +1864,7 @@
           <w:sz w:val="22"/>
           <w:szCs w:val="22"/>
         </w:rPr>
-        <w:t xml:space="preserve">A new, generic, toggleable layer panel now exists on the map: any exposure dataset (population, roads, rivers, basins — and any future source) can be switched on/off independently, is color-coded per layer, and shows a click-to-inspect popup with that feature's key attributes. No source-specific code exists in the rendering path — a new source type appears automatically once imported. This directly addresses earlier feedback that the interface felt “theoretical” compared to reference tools like Google Flood Hub.</w:t>
+        <w:t xml:space="preserve">A new, generic, toggleable layer panel now exists on the map: any exposure dataset (population, roads, rivers, basins — and any future source) can be switched on/off independently, uses graduated, data-driven color coding per layer (added 2026-07-19, replacing one flat color per layer), and shows a click-to-inspect popup with that feature's key attributes. No source-specific code exists in the rendering path — a new source type appears automatically once imported. This directly addresses earlier feedback that the interface felt “theoretical” compared to reference tools like Google Flood Hub.</w:t>
       </w:r>
     </w:p>
     <w:p>

</xml_diff>

<commit_message>
Update Data Sources Inventory with today's second session's findings
- Section 1: PTWC and WHO added (14 live sources total, was 12).
- Section 3: renamed to include Buildings; new OSM/Overpass Buildings
  subsection (critical facilities, spec 044).
- Section 6 ('configured but not wired'): PTWC/WHO removed (now live);
  Meta/HDX Population and GHSL added, each with the specific, now
  well-understood reason it's still blocked (raster size vs. Edge
  Function memory ceiling) instead of vague 'needs research'.
- Section 7: buildings removed from the manual-upload description.
- Section 8: OpenBuildingMap removed (now live); Meta/GHSL bullet
  replaced with real CHIRPS/SPI findings; EU GDO bullet rewritten with
  the actual Global Drought Observatory research (global coverage, ready
  SPI, but NetCDF format this project can't read).
- Summary table counts and statuses updated to match all of the above.

Co-Authored-By: Claude Sonnet 5 <noreply@anthropic.com>
</commit_message>
<xml_diff>
--- a/docs/Data_Sources_Inventory_EN.docx
+++ b/docs/Data_Sources_Inventory_EN.docx
@@ -43,7 +43,7 @@
           <w:sz w:val="22"/>
           <w:szCs w:val="22"/>
         </w:rPr>
-        <w:t xml:space="preserve">Updated 2026-07-20. This document brings together, in a single list, every data source currently in actual use in the project, how each one is fetched or processed, and which category it falls into (live API, one-time aggregation, static file, configured-but-not-wired, or manual upload). It was compiled by scanning the Edge Functions under supabase/functions and the data_sources seed records under supabase/migrations, and reflects real, live-verified data — not just written code.</w:t>
+        <w:t xml:space="preserve">Updated 2026-07-20 (revised same day after a second work session — PTWC/WHO/OSM Buildings went live, Meta/HDX Population and GHSL were attempted and blocked, CHIRPS/SPI and the Global Drought Observatory were researched). This document brings together, in a single list, every data source currently in actual use in the project, how each one is fetched or processed, and which category it falls into (live API, one-time aggregation, static file, configured-but-not-wired, or manual upload). It was compiled by scanning the Edge Functions under supabase/functions and the data_sources seed records under supabase/migrations, and reflects real, live-verified data — not just written code.</w:t>
       </w:r>
     </w:p>
     <w:p>
@@ -68,7 +68,7 @@
           <w:sz w:val="22"/>
           <w:szCs w:val="22"/>
         </w:rPr>
-        <w:t xml:space="preserve">These sources are triggered automatically on a periodic schedule via pg_cron (ranging from minutes to hours); incoming data is normalized and written to the relevant table (earthquake, flood, wildfire, drought, food_security). None of these are aggregations — each run pulls the current live data.</w:t>
+        <w:t xml:space="preserve">These sources are triggered automatically on a periodic schedule via pg_cron (ranging from minutes to hours); incoming data is normalized and written to the relevant table (earthquake, flood, wildfire, drought, food_security). None of these are aggregations — each run pulls the current live data. Two more joined this list on 2026-07-20: PTWC (tsunami, REST bulletin feed, every 3 min) and WHO (epidemic, disease outbreak API, every 30 min) — both existed only as fetch code sitting unused in this project’s pre-Edge-Function aggregator (server/) until today; see the updated Summary Table at the end of this document.</w:t>
       </w:r>
     </w:p>
     <w:tbl>
@@ -1585,7 +1585,7 @@
           <w:sz w:val="22"/>
           <w:szCs w:val="22"/>
         </w:rPr>
-        <w:t xml:space="preserve">Not a live hazard event — a static/periodically updated data layer representing a country's population distribution. Of the four population sources originally evaluated (WorldPop, Meta, GHSL, Kontur), Kontur was the first integrated because it pre-aggregates its data into H3 hexagons on its own end. WorldPop was the second — closing the long-standing raw-raster gap (spec 043): a new source-agnostic raster-to-hexagon pipeline (GeoTIFF read via geotiff.js, pixel-to-H3-cell aggregation via h3-js, no GDAL/native dependency) now converts WorldPop's 100m-resolution population GeoTIFFs into the same hexagon format. Meta/HDX Population and GHSL remain unintegrated (see section 8 below) — their own access patterns haven't been independently confirmed the way WorldPop's have, but the same generic pipeline would onboard them with a small config addition, not new processing code.</w:t>
+        <w:t xml:space="preserve">Not a live hazard event — a static/periodically updated data layer representing a country's population distribution. Of the four population sources originally evaluated (WorldPop, Meta, GHSL, Kontur), Kontur was the first integrated because it pre-aggregates its data into H3 hexagons on its own end. WorldPop was the second — closing the long-standing raw-raster gap (spec 043): a new source-agnostic raster-to-hexagon pipeline (GeoTIFF read via geotiff.js, pixel-to-H3-cell aggregation via h3-js, no GDAL/native dependency) now converts WorldPop's 100m-resolution population GeoTIFFs into the same hexagon format. Meta/HDX Population and GHSL were both attempted on 2026-07-20 and remain unintegrated — see section 6 for the specific, now well-understood blocker each hit (not a vague "needs more research" anymore).</w:t>
       </w:r>
     </w:p>
     <w:p>
@@ -1674,7 +1674,7 @@
         <w:rPr>
           <w:rFonts w:ascii="Arial" w:cs="Arial" w:eastAsia="Arial" w:hAnsi="Arial"/>
         </w:rPr>
-        <w:t xml:space="preserve">3. Auto-Imported Exposure Layers — Roads, Rivers &amp; Watersheds (New)</w:t>
+        <w:t xml:space="preserve">3. Auto-Imported Exposure Layers — Roads, Rivers, Watersheds &amp; Buildings (New)</w:t>
       </w:r>
     </w:p>
     <w:p>
@@ -1687,7 +1687,7 @@
           <w:sz w:val="22"/>
           <w:szCs w:val="22"/>
         </w:rPr>
-        <w:t xml:space="preserve">These three layers were not present in the previous version of this inventory (they were either evaluated-only or delivered via manual upload). All three are now live, automatically imported, and visible on the map as independently toggleable layers with click-to-inspect details (spec 042).</w:t>
+        <w:t xml:space="preserve">These four layers were not present in an earlier version of this inventory (they were either evaluated-only or delivered via manual upload). All four are now live, automatically imported, and visible on the map as independently toggleable layers with click-to-inspect details (spec 042/044).</w:t>
       </w:r>
     </w:p>
     <w:p>
@@ -1797,6 +1797,34 @@
           <w:szCs w:val="22"/>
         </w:rPr>
         <w:t xml:space="preserve">Google's Flood Hub / Flood Forecasting API itself (live flood forecasts, not just the underlying HydroBASINS geometry) was evaluated separately — it is free but currently gated behind a multi-month approval waitlist, incompatible with the demo timeline, and remains out of scope pending access.</w:t>
+      </w:r>
+    </w:p>
+    <w:p>
+      <w:pPr>
+        <w:spacing w:after="100"/>
+      </w:pPr>
+      <w:r>
+        <w:rPr>
+          <w:rFonts w:ascii="Arial" w:cs="Arial" w:eastAsia="Arial" w:hAnsi="Arial"/>
+          <w:b/>
+          <w:bCs/>
+          <w:sz w:val="22"/>
+          <w:szCs w:val="22"/>
+        </w:rPr>
+        <w:t xml:space="preserve">OSM/Overpass Buildings</w:t>
+      </w:r>
+    </w:p>
+    <w:p>
+      <w:pPr>
+        <w:spacing w:after="200"/>
+      </w:pPr>
+      <w:r>
+        <w:rPr>
+          <w:rFonts w:ascii="Arial" w:cs="Arial" w:eastAsia="Arial" w:hAnsi="Arial"/>
+          <w:sz w:val="22"/>
+          <w:szCs w:val="22"/>
+        </w:rPr>
+        <w:t xml:space="preserve">The "OpenBuildingMap" line item from section 8 (evaluated but not integrated) is now live, scoped to critical facilities rather than every OSM building footprint (spec 044): hospitals/clinics, schools/universities, and fire/police/government buildings, queried per served country via the same Overpass pattern as roads (amenity/office tags, not the highway tag). An unscoped building=* query was rejected outright — buildings outnumber roads by 1–2 orders of magnitude in a typical OSM extract, and osmRoadsFetch.ts already documents hitting the deployed Edge Function’s WORKER_RESOURCE_LIMIT at a much smaller scale. Each imported facility is tagged with an asset_category (critical_infrastructure_health/education/emergency) matching the taxonomy get_critical_infrastructure_features() already filters on, and counted (not measured by area) — this answers “how many critical facilities are in the affected area,” the same question ScenarioBuilder.vue already surfaces for population. Deployed and verified successfully invoking (health_state: healthy) as of 2026-07-20; first scheduled data (Sunday 05:00 UTC weekly cron) still pending as of this writing.</w:t>
       </w:r>
     </w:p>
     <w:p>
@@ -1889,7 +1917,7 @@
           <w:sz w:val="22"/>
           <w:szCs w:val="22"/>
         </w:rPr>
-        <w:t xml:space="preserve">These sources have a row in the data_sources table (endpoint URL, poll interval, etc.), but no fetch function has been written to actually call them yet — meaning they currently retrieve no data at all; they are placeholders for future work.</w:t>
+        <w:t xml:space="preserve">PTWC and WHO left this category on 2026-07-20 (now live — see section 1). Meta/HDX Population and GHSL took their place: both now have a data_sources row AND working fetch code, but neither is actually producing data yet, for two different, now well-understood reasons (not vague "needs research" anymore).</w:t>
       </w:r>
     </w:p>
     <w:tbl>
@@ -2031,7 +2059,7 @@
                 <w:sz w:val="20"/>
                 <w:szCs w:val="20"/>
               </w:rPr>
-              <w:t xml:space="preserve">PTWC (REST + RSS)</w:t>
+              <w:t xml:space="preserve">Meta/HDX Population</w:t>
             </w:r>
           </w:p>
         </w:tc>
@@ -2058,7 +2086,7 @@
                 <w:sz w:val="20"/>
                 <w:szCs w:val="20"/>
               </w:rPr>
-              <w:t xml:space="preserve">Tsunami</w:t>
+              <w:t xml:space="preserve">Population (exposure)</w:t>
             </w:r>
           </w:p>
         </w:tc>
@@ -2085,7 +2113,7 @@
                 <w:sz w:val="20"/>
                 <w:szCs w:val="20"/>
               </w:rPr>
-              <w:t xml:space="preserve">Configured in the database, no fetch function exists</w:t>
+              <w:t xml:space="preserve">Per-country HDX package IDs resolved (TR/MG/MY); import code backed out — per-country rasters are ~10–11GB uncompressed (live-verified for Madagascar), too large for this Edge Function’s memory budget and for this machine’s available disk to process locally</w:t>
             </w:r>
           </w:p>
         </w:tc>
@@ -2115,7 +2143,7 @@
                 <w:sz w:val="20"/>
                 <w:szCs w:val="20"/>
               </w:rPr>
-              <w:t xml:space="preserve">WHO</w:t>
+              <w:t xml:space="preserve">GHSL</w:t>
             </w:r>
           </w:p>
         </w:tc>
@@ -2143,7 +2171,7 @@
                 <w:sz w:val="20"/>
                 <w:szCs w:val="20"/>
               </w:rPr>
-              <w:t xml:space="preserve">Epidemic</w:t>
+              <w:t xml:space="preserve">Population (exposure)</w:t>
             </w:r>
           </w:p>
         </w:tc>
@@ -2171,7 +2199,7 @@
                 <w:sz w:val="20"/>
                 <w:szCs w:val="20"/>
               </w:rPr>
-              <w:t xml:space="preserve">Configured in the database, no fetch function exists</w:t>
+              <w:t xml:space="preserve">Fetch code complete and deployed (per-country 10° tile downloads, ~1.5MB each, not the whole 461MB world file); still hits the Edge Function’s memory ceiling within ~7-8s of invocation — found and fixed a real platform bug along the way (geotiff.js referencing the undefined ‘Worker’ global, which had ALSO been silently breaking WorldPop’s already-deployed import function)</w:t>
             </w:r>
           </w:p>
         </w:tc>
@@ -2186,7 +2214,7 @@
         <w:rPr>
           <w:rFonts w:ascii="Arial" w:cs="Arial" w:eastAsia="Arial" w:hAnsi="Arial"/>
         </w:rPr>
-        <w:t xml:space="preserve">7. Data Delivered via Manual Upload (Buildings, Other Exposure Layers)</w:t>
+        <w:t xml:space="preserve">7. Data Delivered via Manual Upload (Other Exposure Layers)</w:t>
       </w:r>
     </w:p>
     <w:p>
@@ -2199,7 +2227,7 @@
           <w:sz w:val="22"/>
           <w:szCs w:val="22"/>
         </w:rPr>
-        <w:t xml:space="preserve">Roads and river/watershed data no longer rely on manual upload (see section 3). Building data (OpenBuildingMap/OSM) and any other custom vector layer still have no automated fetch — a country admin manually uploads a GeoJSON file through the generic upload-exposure-dataset Edge Function; the system validates it and writes it into the same exposure_datasets/exposure_features tables used by every automated source.</w:t>
+        <w:t xml:space="preserve">Roads, river/watershed, and critical-facility building data no longer rely on manual upload (see section 3). Any other custom vector layer — a hospital bed count spreadsheet, a shelter capacity list, anything not covered by an automated source above — still has no automated fetch; a country admin manually uploads a GeoJSON file through the generic upload-exposure-dataset Edge Function; the system validates it and writes it into the same exposure_datasets/exposure_features tables used by every automated source.</w:t>
       </w:r>
     </w:p>
     <w:p>
@@ -2224,7 +2252,7 @@
           <w:sz w:val="22"/>
           <w:szCs w:val="22"/>
         </w:rPr>
-        <w:t xml:space="preserve">Sources from our question list to the partner that have no counterpart in the code at all, for reasons such as raw raster format, paid access, or static/manual data. WorldPop was removed from this list in this update — see section 2 — now that the raster-processing pipeline exists; Meta/HDX Population and GHSL remain here since their own access patterns haven't been independently confirmed yet, though the same pipeline would onboard them via a small config addition per spec 043's design.</w:t>
+        <w:t xml:space="preserve">Sources with no live data flowing yet, for reasons ranging from "needs a decision only a human should make" (INFORM Index) to "needs real work this session couldn't finish" (CHIRPS/SPI, EU/Global Drought Observatory). OpenBuildingMap was removed from this list in this update — see section 3 — now live. Meta/HDX Population and GHSL moved to section 6 ("configured but not wired") — both were actually attempted this session, not just evaluated on paper, and each hit a specific, understood blocker rather than an unknown one.</w:t>
       </w:r>
     </w:p>
     <w:p>
@@ -2242,7 +2270,7 @@
           <w:sz w:val="22"/>
           <w:szCs w:val="22"/>
         </w:rPr>
-        <w:t xml:space="preserve">Meta/HDX Population, GHSL — raw raster/pixel-level data; access pattern (registration, licensing, file format) not yet independently confirmed the way WorldPop's was.</w:t>
+        <w:t xml:space="preserve">SPI / CHIRPS — CHIRPS' raw daily rainfall rasters ARE freely accessible (data.chc.ucsb.edu, no key) and technically importable via the same raster pipeline as WorldPop/GHSL. But this line item asks for SPI (Standardized Precipitation Index), not raw rainfall — SPI is a real statistical product requiring 30+ years of per-pixel rainfall history fit to a gamma distribution, not something derivable from a single downloaded raster. Live-verified 2026-07-20: no provider publishes a ready-made SPI raster for direct download either (checked CHIRPS' own documentation and tooling) — the only source found with a genuinely ready-made SPI product is the Global Drought Observatory (see next item), in a format this project can't read yet.</w:t>
       </w:r>
     </w:p>
     <w:p>
@@ -2278,7 +2306,7 @@
           <w:sz w:val="22"/>
           <w:szCs w:val="22"/>
         </w:rPr>
-        <w:t xml:space="preserve">SPI / Drought.gov (CMORPH), CHIRPS — scope/format clarification pending (likely raster).</w:t>
+        <w:t xml:space="preserve">Global Drought Observatory (JRC/Copernicus) — Soil Moisture Anomaly, FAPAR, AND a ready-made SPI, truly global (not Europe-only despite the similarly-named EDO), free, no registration (live-verified 2026-07-20: a plain, anonymous Apache directory listing at drought.emergency.copernicus.eu/data/..., updated 3x/month). This is the single best drought-data source found this session — but it publishes NetCDF, not GeoTIFF, and this project has no NetCDF reader (geotiff.js/rasterToHexagon.ts is GeoTIFF-only). Also noted: the most recent file in the directory checked was from mid-2024 despite the "3x/month" claim — worth re-verifying before building against it. Building NetCDF support is a bigger, separate task, not attempted this session.</w:t>
       </w:r>
     </w:p>
     <w:p>
@@ -2296,43 +2324,7 @@
           <w:sz w:val="22"/>
           <w:szCs w:val="22"/>
         </w:rPr>
-        <w:t xml:space="preserve">EU GDO (Soil Moisture), FAPAR — API endpoint and account requirement clarification pending.</w:t>
-      </w:r>
-    </w:p>
-    <w:p>
-      <w:pPr>
-        <w:pStyle w:val="ListParagraph"/>
-        <w:numPr>
-          <w:ilvl w:val="0"/>
-          <w:numId w:val="2"/>
-        </w:numPr>
-        <w:spacing w:after="100"/>
-      </w:pPr>
-      <w:r>
-        <w:rPr>
-          <w:rFonts w:ascii="Arial" w:cs="Arial" w:eastAsia="Arial" w:hAnsi="Arial"/>
-          <w:sz w:val="22"/>
-          <w:szCs w:val="22"/>
-        </w:rPr>
         <w:t xml:space="preserve">JRC GFM — overlaps with GloFAS, requires registration.</w:t>
-      </w:r>
-    </w:p>
-    <w:p>
-      <w:pPr>
-        <w:pStyle w:val="ListParagraph"/>
-        <w:numPr>
-          <w:ilvl w:val="0"/>
-          <w:numId w:val="2"/>
-        </w:numPr>
-        <w:spacing w:after="100"/>
-      </w:pPr>
-      <w:r>
-        <w:rPr>
-          <w:rFonts w:ascii="Arial" w:cs="Arial" w:eastAsia="Arial" w:hAnsi="Arial"/>
-          <w:sz w:val="22"/>
-          <w:szCs w:val="22"/>
-        </w:rPr>
-        <w:t xml:space="preserve">OpenBuildingMap — programmatic access clarification pending.</w:t>
       </w:r>
     </w:p>
     <w:p>
@@ -2518,7 +2510,7 @@
                 <w:sz w:val="20"/>
                 <w:szCs w:val="20"/>
               </w:rPr>
-              <w:t xml:space="preserve">12 sources</w:t>
+              <w:t xml:space="preserve">14 sources</w:t>
             </w:r>
           </w:p>
         </w:tc>
@@ -2545,7 +2537,7 @@
                 <w:sz w:val="20"/>
                 <w:szCs w:val="20"/>
               </w:rPr>
-              <w:t xml:space="preserve">Active, running on cron</w:t>
+              <w:t xml:space="preserve">Active, running on cron (added 2026-07-20: PTWC, WHO)</w:t>
             </w:r>
           </w:p>
         </w:tc>
@@ -2660,7 +2652,7 @@
                 <w:sz w:val="20"/>
                 <w:szCs w:val="20"/>
               </w:rPr>
-              <w:t xml:space="preserve">Roads / rivers / watersheds (auto-imported)</w:t>
+              <w:t xml:space="preserve">Roads / rivers / watersheds / critical-facility buildings (auto-imported)</w:t>
             </w:r>
           </w:p>
         </w:tc>
@@ -2687,7 +2679,7 @@
                 <w:sz w:val="20"/>
                 <w:szCs w:val="20"/>
               </w:rPr>
-              <w:t xml:space="preserve">3 sources</w:t>
+              <w:t xml:space="preserve">4 sources</w:t>
             </w:r>
           </w:p>
         </w:tc>
@@ -2714,7 +2706,7 @@
                 <w:sz w:val="20"/>
                 <w:szCs w:val="20"/>
               </w:rPr>
-              <w:t xml:space="preserve">Live — Turkey + Madagascar</w:t>
+              <w:t xml:space="preserve">Live — Turkey + Madagascar (buildings’ first data pending Sunday cron)</w:t>
             </w:r>
           </w:p>
         </w:tc>
@@ -2941,7 +2933,7 @@
                 <w:sz w:val="20"/>
                 <w:szCs w:val="20"/>
               </w:rPr>
-              <w:t xml:space="preserve">2 sources (PTWC, WHO)</w:t>
+              <w:t xml:space="preserve">2 sources (Meta/HDX Population, GHSL)</w:t>
             </w:r>
           </w:p>
         </w:tc>
@@ -2969,7 +2961,7 @@
                 <w:sz w:val="20"/>
                 <w:szCs w:val="20"/>
               </w:rPr>
-              <w:t xml:space="preserve">Configuration only, no fetch code</w:t>
+              <w:t xml:space="preserve">Both attempted 2026-07-20 — see section 6 for why each is still blocked</w:t>
             </w:r>
           </w:p>
         </w:tc>
@@ -3110,7 +3102,7 @@
                 <w:sz w:val="20"/>
                 <w:szCs w:val="20"/>
               </w:rPr>
-              <w:t xml:space="preserve">5 sources</w:t>
+              <w:t xml:space="preserve">4 sources</w:t>
             </w:r>
           </w:p>
         </w:tc>
@@ -3138,7 +3130,7 @@
                 <w:sz w:val="20"/>
                 <w:szCs w:val="20"/>
               </w:rPr>
-              <w:t xml:space="preserve">No code counterpart yet; raster pipeline exists, config-only to add</w:t>
+              <w:t xml:space="preserve">INFORM Index (no API, needs a manual/yearly process, not code); CHIRPS/SPI + Global Drought Observatory (real data found, but real statistical/format work remains); JRC GFM (redundant with GloFAS, deliberately skipped)</w:t>
             </w:r>
           </w:p>
         </w:tc>

</xml_diff>